<commit_message>
fix: correção da especificação do caso de uso Manter Anamnese. Issue #46
</commit_message>
<xml_diff>
--- a/Requisitos/UC13_Manter Anamnese.docx
+++ b/Requisitos/UC13_Manter Anamnese.docx
@@ -635,9 +635,11 @@
                 <w:right w:space="0" w:sz="0" w:val="nil"/>
                 <w:between w:space="0" w:sz="0" w:val="nil"/>
               </w:pBdr>
-              <w:ind w:left="360" w:hanging="360"/>
-              <w:rPr>
-                <w:color w:val="000000"/>
+              <w:ind w:left="720" w:hanging="360"/>
+              <w:rPr>
+                <w:sz w:val="28"/>
+                <w:szCs w:val="28"/>
+                <w:u w:val="none"/>
               </w:rPr>
             </w:pPr>
             <w:r>
@@ -685,9 +687,11 @@
                 <w:right w:space="0" w:sz="0" w:val="nil"/>
                 <w:between w:space="0" w:sz="0" w:val="nil"/>
               </w:pBdr>
-              <w:ind w:left="360" w:hanging="360"/>
-              <w:rPr>
-                <w:color w:val="000000"/>
+              <w:ind w:left="720" w:hanging="360"/>
+              <w:rPr>
+                <w:sz w:val="28"/>
+                <w:szCs w:val="28"/>
+                <w:u w:val="none"/>
               </w:rPr>
             </w:pPr>
             <w:r>
@@ -761,19 +765,13 @@
                 <w:right w:space="0" w:sz="0" w:val="nil"/>
                 <w:between w:space="0" w:sz="0" w:val="nil"/>
               </w:pBdr>
-              <w:ind w:left="360" w:hanging="360"/>
-              <w:rPr>
-                <w:color w:val="000000"/>
-              </w:rPr>
-            </w:pPr>
-            <w:r>
-              <w:rPr>
-                <w:sz w:val="14"/>
-                <w:szCs w:val="14"/>
-                <w:rtl w:val="0"/>
-              </w:rPr>
-              <w:t xml:space="preserve"> </w:t>
-            </w:r>
+              <w:ind w:left="720" w:hanging="360"/>
+              <w:rPr>
+                <w:sz w:val="28"/>
+                <w:szCs w:val="28"/>
+                <w:u w:val="none"/>
+              </w:rPr>
+            </w:pPr>
             <w:r>
               <w:rPr>
                 <w:sz w:val="28"/>
@@ -796,9 +794,11 @@
                 <w:right w:space="0" w:sz="0" w:val="nil"/>
                 <w:between w:space="0" w:sz="0" w:val="nil"/>
               </w:pBdr>
-              <w:ind w:left="360" w:hanging="360"/>
-              <w:rPr>
-                <w:color w:val="000000"/>
+              <w:ind w:left="720" w:hanging="360"/>
+              <w:rPr>
+                <w:sz w:val="28"/>
+                <w:szCs w:val="28"/>
+                <w:u w:val="none"/>
               </w:rPr>
             </w:pPr>
             <w:r>
@@ -840,7 +840,7 @@
                 <w:right w:space="0" w:sz="0" w:val="nil"/>
                 <w:between w:space="0" w:sz="0" w:val="nil"/>
               </w:pBdr>
-              <w:ind w:left="360" w:hanging="360"/>
+              <w:ind w:left="720" w:hanging="360"/>
               <w:rPr>
                 <w:sz w:val="28"/>
                 <w:szCs w:val="28"/>
@@ -869,7 +869,7 @@
                 <w:right w:space="0" w:sz="0" w:val="nil"/>
                 <w:between w:space="0" w:sz="0" w:val="nil"/>
               </w:pBdr>
-              <w:ind w:left="360" w:hanging="360"/>
+              <w:ind w:left="720" w:hanging="360"/>
               <w:rPr>
                 <w:sz w:val="28"/>
                 <w:szCs w:val="28"/>
@@ -904,6 +904,10 @@
           </w:p>
           <w:p>
             <w:pPr>
+              <w:numPr>
+                <w:ilvl w:val="0"/>
+                <w:numId w:val="3"/>
+              </w:numPr>
               <w:pBdr>
                 <w:top w:space="0" w:sz="0" w:val="nil"/>
                 <w:left w:space="0" w:sz="0" w:val="nil"/>
@@ -911,18 +915,21 @@
                 <w:right w:space="0" w:sz="0" w:val="nil"/>
                 <w:between w:space="0" w:sz="0" w:val="nil"/>
               </w:pBdr>
-              <w:rPr>
-                <w:color w:val="000000"/>
-              </w:rPr>
-            </w:pPr>
-            <w:r>
-              <w:rPr>
-                <w:color w:val="000000"/>
-                <w:sz w:val="28"/>
-                <w:szCs w:val="28"/>
-                <w:rtl w:val="0"/>
-              </w:rPr>
-              <w:t xml:space="preserve">3. Ator seleciona uma das </w:t>
+              <w:ind w:left="720" w:hanging="360"/>
+              <w:rPr>
+                <w:sz w:val="28"/>
+                <w:szCs w:val="28"/>
+                <w:u w:val="none"/>
+              </w:rPr>
+            </w:pPr>
+            <w:r>
+              <w:rPr>
+                <w:color w:val="000000"/>
+                <w:sz w:val="28"/>
+                <w:szCs w:val="28"/>
+                <w:rtl w:val="0"/>
+              </w:rPr>
+              <w:t xml:space="preserve">Ator seleciona uma das </w:t>
             </w:r>
             <w:r>
               <w:rPr>
@@ -949,6 +956,10 @@
           </w:p>
           <w:p>
             <w:pPr>
+              <w:numPr>
+                <w:ilvl w:val="0"/>
+                <w:numId w:val="3"/>
+              </w:numPr>
               <w:pBdr>
                 <w:top w:space="0" w:sz="0" w:val="nil"/>
                 <w:left w:space="0" w:sz="0" w:val="nil"/>
@@ -956,18 +967,21 @@
                 <w:right w:space="0" w:sz="0" w:val="nil"/>
                 <w:between w:space="0" w:sz="0" w:val="nil"/>
               </w:pBdr>
-              <w:rPr>
-                <w:color w:val="000000"/>
-              </w:rPr>
-            </w:pPr>
-            <w:r>
-              <w:rPr>
-                <w:color w:val="000000"/>
-                <w:sz w:val="28"/>
-                <w:szCs w:val="28"/>
-                <w:rtl w:val="0"/>
-              </w:rPr>
-              <w:t xml:space="preserve">4. Caso a opção seja:</w:t>
+              <w:ind w:left="720" w:hanging="360"/>
+              <w:rPr>
+                <w:sz w:val="28"/>
+                <w:szCs w:val="28"/>
+                <w:u w:val="none"/>
+              </w:rPr>
+            </w:pPr>
+            <w:r>
+              <w:rPr>
+                <w:color w:val="000000"/>
+                <w:sz w:val="28"/>
+                <w:szCs w:val="28"/>
+                <w:rtl w:val="0"/>
+              </w:rPr>
+              <w:t xml:space="preserve">Caso a opção seja:</w:t>
             </w:r>
             <w:r>
               <w:rPr>
@@ -991,6 +1005,14 @@
             </w:pPr>
             <w:r>
               <w:rPr>
+                <w:sz w:val="28"/>
+                <w:szCs w:val="28"/>
+                <w:rtl w:val="0"/>
+              </w:rPr>
+              <w:t xml:space="preserve">     </w:t>
+            </w:r>
+            <w:r>
+              <w:rPr>
                 <w:color w:val="000000"/>
                 <w:sz w:val="28"/>
                 <w:szCs w:val="28"/>
@@ -1040,69 +1062,38 @@
               </w:pBdr>
               <w:ind w:left="360" w:firstLine="0"/>
               <w:rPr>
-                <w:color w:val="ff0000"/>
-                <w:sz w:val="28"/>
-                <w:szCs w:val="28"/>
-              </w:rPr>
-            </w:pPr>
-            <w:r>
-              <w:rPr>
-                <w:color w:val="000000"/>
-                <w:sz w:val="28"/>
-                <w:szCs w:val="28"/>
-                <w:rtl w:val="0"/>
-              </w:rPr>
-              <w:t xml:space="preserve">b) Ícone de alteração(lápis): Ver </w:t>
-            </w:r>
-            <w:r>
-              <w:rPr>
-                <w:color w:val="ff0000"/>
-                <w:sz w:val="28"/>
-                <w:szCs w:val="28"/>
-                <w:rtl w:val="0"/>
-              </w:rPr>
-              <w:t xml:space="preserve">Seção Alterar Anamnese.</w:t>
-            </w:r>
-          </w:p>
-          <w:p>
-            <w:pPr>
-              <w:pBdr>
-                <w:top w:space="0" w:sz="0" w:val="nil"/>
-                <w:left w:space="0" w:sz="0" w:val="nil"/>
-                <w:bottom w:space="0" w:sz="0" w:val="nil"/>
-                <w:right w:space="0" w:sz="0" w:val="nil"/>
-                <w:between w:space="0" w:sz="0" w:val="nil"/>
-              </w:pBdr>
-              <w:rPr>
-                <w:color w:val="000000"/>
-              </w:rPr>
-            </w:pPr>
-            <w:r>
-              <w:rPr>
-                <w:color w:val="000000"/>
-                <w:sz w:val="28"/>
-                <w:szCs w:val="28"/>
-                <w:rtl w:val="0"/>
-              </w:rPr>
-              <w:t xml:space="preserve">5. Sistema retorna ao passo 2.</w:t>
-            </w:r>
-            <w:r>
-              <w:rPr>
-                <w:rtl w:val="0"/>
-              </w:rPr>
-            </w:r>
-          </w:p>
-          <w:p>
-            <w:pPr>
-              <w:pStyle w:val="Heading2"/>
-              <w:jc w:val="left"/>
-              <w:rPr>
                 <w:b w:val="1"/>
                 <w:bCs w:val="1"/>
                 <w:sz w:val="32"/>
                 <w:szCs w:val="32"/>
               </w:rPr>
             </w:pPr>
+            <w:r>
+              <w:rPr>
+                <w:sz w:val="28"/>
+                <w:szCs w:val="28"/>
+                <w:rtl w:val="0"/>
+              </w:rPr>
+              <w:t xml:space="preserve">     </w:t>
+            </w:r>
+            <w:r>
+              <w:rPr>
+                <w:color w:val="000000"/>
+                <w:sz w:val="28"/>
+                <w:szCs w:val="28"/>
+                <w:rtl w:val="0"/>
+              </w:rPr>
+              <w:t xml:space="preserve">b) Ícone de alteração(lápis): Ver </w:t>
+            </w:r>
+            <w:r>
+              <w:rPr>
+                <w:color w:val="ff0000"/>
+                <w:sz w:val="28"/>
+                <w:szCs w:val="28"/>
+                <w:rtl w:val="0"/>
+              </w:rPr>
+              <w:t xml:space="preserve">Seção Alterar Anamnese.</w:t>
+            </w:r>
             <w:r>
               <w:rPr>
                 <w:rtl w:val="0"/>
@@ -1277,7 +1268,24 @@
                 <w:szCs w:val="28"/>
                 <w:rtl w:val="0"/>
               </w:rPr>
-              <w:t xml:space="preserve">Altera os dados do serviço em meio persistente.</w:t>
+              <w:t xml:space="preserve">Altera os dados d</w:t>
+            </w:r>
+            <w:r>
+              <w:rPr>
+                <w:sz w:val="28"/>
+                <w:szCs w:val="28"/>
+                <w:rtl w:val="0"/>
+              </w:rPr>
+              <w:t xml:space="preserve">a anamnese </w:t>
+            </w:r>
+            <w:r>
+              <w:rPr>
+                <w:color w:val="000000"/>
+                <w:sz w:val="28"/>
+                <w:szCs w:val="28"/>
+                <w:rtl w:val="0"/>
+              </w:rPr>
+              <w:t xml:space="preserve">em meio persistente.</w:t>
             </w:r>
             <w:r>
               <w:rPr>
@@ -1686,13 +1694,20 @@
               <w:ind w:hanging="360"/>
               <w:jc w:val="center"/>
               <w:rPr>
+                <w:color w:val="000000"/>
+              </w:rPr>
+            </w:pPr>
+            <w:r>
+              <w:rPr>
                 <w:b w:val="1"/>
                 <w:bCs w:val="1"/>
                 <w:color w:val="000000"/>
                 <w:sz w:val="28"/>
                 <w:szCs w:val="28"/>
-              </w:rPr>
-            </w:pPr>
+                <w:rtl w:val="0"/>
+              </w:rPr>
+              <w:t xml:space="preserve">Fluxo Alternativo</w:t>
+            </w:r>
             <w:r>
               <w:rPr>
                 <w:rtl w:val="0"/>
@@ -1732,62 +1747,6 @@
                 <w:right w:space="0" w:sz="0" w:val="nil"/>
                 <w:between w:space="0" w:sz="0" w:val="nil"/>
               </w:pBdr>
-              <w:ind w:hanging="360"/>
-              <w:jc w:val="center"/>
-              <w:rPr>
-                <w:color w:val="000000"/>
-              </w:rPr>
-            </w:pPr>
-            <w:r>
-              <w:rPr>
-                <w:b w:val="1"/>
-                <w:bCs w:val="1"/>
-                <w:color w:val="000000"/>
-                <w:sz w:val="28"/>
-                <w:szCs w:val="28"/>
-                <w:rtl w:val="0"/>
-              </w:rPr>
-              <w:t xml:space="preserve">Fluxo Alternativo</w:t>
-            </w:r>
-            <w:r>
-              <w:rPr>
-                <w:rtl w:val="0"/>
-              </w:rPr>
-            </w:r>
-          </w:p>
-        </w:tc>
-      </w:tr>
-      <w:tr>
-        <w:trPr>
-          <w:cantSplit w:val="0"/>
-          <w:trHeight w:val="360" w:hRule="atLeast"/>
-          <w:tblHeader w:val="0"/>
-        </w:trPr>
-        <w:tc>
-          <w:tcPr>
-            <w:gridSpan w:val="2"/>
-            <w:tcBorders>
-              <w:top w:color="000000" w:space="0" w:sz="4" w:val="single"/>
-              <w:left w:color="000000" w:space="0" w:sz="4" w:val="single"/>
-              <w:bottom w:color="000000" w:space="0" w:sz="4" w:val="single"/>
-              <w:right w:color="000000" w:space="0" w:sz="4" w:val="single"/>
-            </w:tcBorders>
-            <w:tcMar>
-              <w:top w:w="0.0" w:type="dxa"/>
-              <w:left w:w="70.0" w:type="dxa"/>
-              <w:bottom w:w="0.0" w:type="dxa"/>
-              <w:right w:w="70.0" w:type="dxa"/>
-            </w:tcMar>
-          </w:tcPr>
-          <w:p>
-            <w:pPr>
-              <w:pBdr>
-                <w:top w:space="0" w:sz="0" w:val="nil"/>
-                <w:left w:space="0" w:sz="0" w:val="nil"/>
-                <w:bottom w:space="0" w:sz="0" w:val="nil"/>
-                <w:right w:space="0" w:sz="0" w:val="nil"/>
-                <w:between w:space="0" w:sz="0" w:val="nil"/>
-              </w:pBdr>
               <w:rPr>
                 <w:color w:val="000000"/>
               </w:rPr>
@@ -1986,7 +1945,127 @@
                 <w:szCs w:val="28"/>
                 <w:rtl w:val="0"/>
               </w:rPr>
-              <w:t xml:space="preserve">Linha 1:</w:t>
+              <w:t xml:space="preserve">Linha 1 Fluxo Principal:</w:t>
+            </w:r>
+            <w:r>
+              <w:rPr>
+                <w:sz w:val="28"/>
+                <w:szCs w:val="28"/>
+                <w:rtl w:val="0"/>
+              </w:rPr>
+              <w:t xml:space="preserve"> Ator decide voltar</w:t>
+            </w:r>
+          </w:p>
+          <w:p>
+            <w:pPr>
+              <w:pBdr>
+                <w:top w:space="0" w:sz="0" w:val="nil"/>
+                <w:left w:space="0" w:sz="0" w:val="nil"/>
+                <w:bottom w:space="0" w:sz="0" w:val="nil"/>
+                <w:right w:space="0" w:sz="0" w:val="nil"/>
+                <w:between w:space="0" w:sz="0" w:val="nil"/>
+              </w:pBdr>
+              <w:ind w:left="0" w:firstLine="0"/>
+              <w:rPr>
+                <w:sz w:val="28"/>
+                <w:szCs w:val="28"/>
+              </w:rPr>
+            </w:pPr>
+            <w:r>
+              <w:rPr>
+                <w:sz w:val="28"/>
+                <w:szCs w:val="28"/>
+                <w:rtl w:val="0"/>
+              </w:rPr>
+              <w:t xml:space="preserve">    1. Ator clica em “Voltar”.</w:t>
+            </w:r>
+          </w:p>
+          <w:p>
+            <w:pPr>
+              <w:pBdr>
+                <w:top w:space="0" w:sz="0" w:val="nil"/>
+                <w:left w:space="0" w:sz="0" w:val="nil"/>
+                <w:bottom w:space="0" w:sz="0" w:val="nil"/>
+                <w:right w:space="0" w:sz="0" w:val="nil"/>
+                <w:between w:space="0" w:sz="0" w:val="nil"/>
+              </w:pBdr>
+              <w:ind w:left="0" w:firstLine="0"/>
+              <w:rPr>
+                <w:sz w:val="28"/>
+                <w:szCs w:val="28"/>
+              </w:rPr>
+            </w:pPr>
+            <w:r>
+              <w:rPr>
+                <w:sz w:val="28"/>
+                <w:szCs w:val="28"/>
+                <w:rtl w:val="0"/>
+              </w:rPr>
+              <w:t xml:space="preserve">    2. Sistema retorna ao Passo 6 da </w:t>
+            </w:r>
+            <w:r>
+              <w:rPr>
+                <w:color w:val="ff0000"/>
+                <w:sz w:val="28"/>
+                <w:szCs w:val="28"/>
+                <w:rtl w:val="0"/>
+              </w:rPr>
+              <w:t xml:space="preserve">Seção Principal</w:t>
+            </w:r>
+            <w:r>
+              <w:rPr>
+                <w:sz w:val="28"/>
+                <w:szCs w:val="28"/>
+                <w:rtl w:val="0"/>
+              </w:rPr>
+              <w:t xml:space="preserve">.</w:t>
+            </w:r>
+          </w:p>
+          <w:p>
+            <w:pPr>
+              <w:pBdr>
+                <w:top w:space="0" w:sz="0" w:val="nil"/>
+                <w:left w:space="0" w:sz="0" w:val="nil"/>
+                <w:bottom w:space="0" w:sz="0" w:val="nil"/>
+                <w:right w:space="0" w:sz="0" w:val="nil"/>
+                <w:between w:space="0" w:sz="0" w:val="nil"/>
+              </w:pBdr>
+              <w:ind w:left="0" w:firstLine="0"/>
+              <w:rPr>
+                <w:sz w:val="28"/>
+                <w:szCs w:val="28"/>
+              </w:rPr>
+            </w:pPr>
+            <w:r>
+              <w:rPr>
+                <w:rtl w:val="0"/>
+              </w:rPr>
+            </w:r>
+          </w:p>
+          <w:p>
+            <w:pPr>
+              <w:pBdr>
+                <w:top w:space="0" w:sz="0" w:val="nil"/>
+                <w:left w:space="0" w:sz="0" w:val="nil"/>
+                <w:bottom w:space="0" w:sz="0" w:val="nil"/>
+                <w:right w:space="0" w:sz="0" w:val="nil"/>
+                <w:between w:space="0" w:sz="0" w:val="nil"/>
+              </w:pBdr>
+              <w:ind w:left="0" w:firstLine="0"/>
+              <w:rPr>
+                <w:sz w:val="28"/>
+                <w:szCs w:val="28"/>
+              </w:rPr>
+            </w:pPr>
+            <w:r>
+              <w:rPr>
+                <w:b w:val="1"/>
+                <w:bCs w:val="1"/>
+                <w:sz w:val="28"/>
+                <w:szCs w:val="28"/>
+                <w:rtl w:val="0"/>
+              </w:rPr>
+              <w:t xml:space="preserve">Linha 1 Fluxo Alternativo 1:</w:t>
             </w:r>
             <w:r>
               <w:rPr>
@@ -2929,27 +3008,33 @@
       <w:pPr>
         <w:ind w:left="720" w:hanging="360"/>
       </w:pPr>
-      <w:rPr/>
+      <w:rPr>
+        <w:u w:val="none"/>
+      </w:rPr>
     </w:lvl>
     <w:lvl w:ilvl="1">
       <w:start w:val="1"/>
-      <w:numFmt w:val="decimal"/>
+      <w:numFmt w:val="lowerLetter"/>
       <w:lvlText w:val="%2."/>
       <w:lvlJc w:val="left"/>
       <w:pPr>
         <w:ind w:left="1440" w:hanging="360"/>
       </w:pPr>
-      <w:rPr/>
+      <w:rPr>
+        <w:u w:val="none"/>
+      </w:rPr>
     </w:lvl>
     <w:lvl w:ilvl="2">
       <w:start w:val="1"/>
-      <w:numFmt w:val="decimal"/>
+      <w:numFmt w:val="lowerRoman"/>
       <w:lvlText w:val="%3."/>
-      <w:lvlJc w:val="left"/>
+      <w:lvlJc w:val="right"/>
       <w:pPr>
         <w:ind w:left="2160" w:hanging="360"/>
       </w:pPr>
-      <w:rPr/>
+      <w:rPr>
+        <w:u w:val="none"/>
+      </w:rPr>
     </w:lvl>
     <w:lvl w:ilvl="3">
       <w:start w:val="1"/>
@@ -2959,27 +3044,33 @@
       <w:pPr>
         <w:ind w:left="2880" w:hanging="360"/>
       </w:pPr>
-      <w:rPr/>
+      <w:rPr>
+        <w:u w:val="none"/>
+      </w:rPr>
     </w:lvl>
     <w:lvl w:ilvl="4">
       <w:start w:val="1"/>
-      <w:numFmt w:val="decimal"/>
+      <w:numFmt w:val="lowerLetter"/>
       <w:lvlText w:val="%5."/>
       <w:lvlJc w:val="left"/>
       <w:pPr>
         <w:ind w:left="3600" w:hanging="360"/>
       </w:pPr>
-      <w:rPr/>
+      <w:rPr>
+        <w:u w:val="none"/>
+      </w:rPr>
     </w:lvl>
     <w:lvl w:ilvl="5">
       <w:start w:val="1"/>
-      <w:numFmt w:val="decimal"/>
+      <w:numFmt w:val="lowerRoman"/>
       <w:lvlText w:val="%6."/>
-      <w:lvlJc w:val="left"/>
+      <w:lvlJc w:val="right"/>
       <w:pPr>
         <w:ind w:left="4320" w:hanging="360"/>
       </w:pPr>
-      <w:rPr/>
+      <w:rPr>
+        <w:u w:val="none"/>
+      </w:rPr>
     </w:lvl>
     <w:lvl w:ilvl="6">
       <w:start w:val="1"/>
@@ -2989,27 +3080,33 @@
       <w:pPr>
         <w:ind w:left="5040" w:hanging="360"/>
       </w:pPr>
-      <w:rPr/>
+      <w:rPr>
+        <w:u w:val="none"/>
+      </w:rPr>
     </w:lvl>
     <w:lvl w:ilvl="7">
       <w:start w:val="1"/>
-      <w:numFmt w:val="decimal"/>
+      <w:numFmt w:val="lowerLetter"/>
       <w:lvlText w:val="%8."/>
       <w:lvlJc w:val="left"/>
       <w:pPr>
         <w:ind w:left="5760" w:hanging="360"/>
       </w:pPr>
-      <w:rPr/>
+      <w:rPr>
+        <w:u w:val="none"/>
+      </w:rPr>
     </w:lvl>
     <w:lvl w:ilvl="8">
       <w:start w:val="1"/>
-      <w:numFmt w:val="decimal"/>
+      <w:numFmt w:val="lowerRoman"/>
       <w:lvlText w:val="%9."/>
-      <w:lvlJc w:val="left"/>
+      <w:lvlJc w:val="right"/>
       <w:pPr>
         <w:ind w:left="6480" w:hanging="360"/>
       </w:pPr>
-      <w:rPr/>
+      <w:rPr>
+        <w:u w:val="none"/>
+      </w:rPr>
     </w:lvl>
   </w:abstractNum>
   <w:abstractNum w:abstractNumId="4">

</xml_diff>